<commit_message>
chore: snapshot current conversion and layout fixes before cleanup
</commit_message>
<xml_diff>
--- a/input_data/Template_word/conference-template-a4 (ieee).docx
+++ b/input_data/Template_word/conference-template-a4 (ieee).docx
@@ -1,6 +1,6 @@
 
 <file path=word/document.xml><?xml version="1.0" encoding="utf-8"?>
-<w:document xmlns:cx="http://schemas.microsoft.com/office/drawing/2014/chartex" xmlns:cx1="http://schemas.microsoft.com/office/drawing/2015/9/8/chartex" xmlns:cx2="http://schemas.microsoft.com/office/drawing/2015/10/21/chartex" xmlns:cx3="http://schemas.microsoft.com/office/drawing/2016/5/9/chartex" xmlns:cx4="http://schemas.microsoft.com/office/drawing/2016/5/10/chartex" xmlns:cx5="http://schemas.microsoft.com/office/drawing/2016/5/11/chartex" xmlns:cx6="http://schemas.microsoft.com/office/drawing/2016/5/12/chartex" xmlns:cx7="http://schemas.microsoft.com/office/drawing/2016/5/13/chartex" xmlns:cx8="http://schemas.microsoft.com/office/drawing/2016/5/14/chartex" xmlns:mc="http://schemas.openxmlformats.org/markup-compatibility/2006" xmlns:aink="http://schemas.microsoft.com/office/drawing/2016/ink" xmlns:am3d="http://schemas.microsoft.com/office/drawing/2017/model3d" xmlns:o="urn:schemas-microsoft-com:office:office" xmlns:oel="http://schemas.microsoft.com/office/2019/extlst" xmlns:r="http://purl.oclc.org/ooxml/officeDocument/relationships" xmlns:m="http://purl.oclc.org/ooxml/officeDocument/math" xmlns:v="urn:schemas-microsoft-com:vml" xmlns:wp14="http://schemas.microsoft.com/office/word/2010/wordprocessingDrawing" xmlns:wp="http://purl.oclc.org/ooxml/drawingml/wordprocessingDrawing" xmlns:w10="urn:schemas-microsoft-com:office:word" xmlns:w="http://purl.oclc.org/ooxml/wordprocessingml/main" xmlns:w14="http://schemas.microsoft.com/office/word/2010/wordml" xmlns:w15="http://schemas.microsoft.com/office/word/2012/wordml" xmlns:w16cex="http://schemas.microsoft.com/office/word/2018/wordml/cex" xmlns:w16cid="http://schemas.microsoft.com/office/word/2016/wordml/cid" xmlns:w16="http://schemas.microsoft.com/office/word/2018/wordml" xmlns:w16sdtdh="http://schemas.microsoft.com/office/word/2020/wordml/sdtdatahash" xmlns:w16se="http://schemas.microsoft.com/office/word/2015/wordml/symex" xmlns:wpi="http://schemas.microsoft.com/office/word/2010/wordprocessingInk" xmlns:wne="http://schemas.microsoft.com/office/word/2006/wordml" mc:Ignorable="w14 w15 w16se w16cid w16 w16cex w16sdtdh wne wp14" w:conformance="strict">
+<w:document xmlns:cx="http://schemas.microsoft.com/office/drawing/2014/chartex" xmlns:cx1="http://schemas.microsoft.com/office/drawing/2015/9/8/chartex" xmlns:cx2="http://schemas.microsoft.com/office/drawing/2015/10/21/chartex" xmlns:cx3="http://schemas.microsoft.com/office/drawing/2016/5/9/chartex" xmlns:cx4="http://schemas.microsoft.com/office/drawing/2016/5/10/chartex" xmlns:cx5="http://schemas.microsoft.com/office/drawing/2016/5/11/chartex" xmlns:cx6="http://schemas.microsoft.com/office/drawing/2016/5/12/chartex" xmlns:cx7="http://schemas.microsoft.com/office/drawing/2016/5/13/chartex" xmlns:cx8="http://schemas.microsoft.com/office/drawing/2016/5/14/chartex" xmlns:mc="http://schemas.openxmlformats.org/markup-compatibility/2006" xmlns:aink="http://schemas.microsoft.com/office/drawing/2016/ink" xmlns:am3d="http://schemas.microsoft.com/office/drawing/2017/model3d" xmlns:o="urn:schemas-microsoft-com:office:office" xmlns:oel="http://schemas.microsoft.com/office/2019/extlst" xmlns:r="http://purl.oclc.org/ooxml/officeDocument/relationships" xmlns:m="http://purl.oclc.org/ooxml/officeDocument/math" xmlns:v="urn:schemas-microsoft-com:vml" xmlns:wp14="http://schemas.microsoft.com/office/word/2010/wordprocessingDrawing" xmlns:wp="http://purl.oclc.org/ooxml/drawingml/wordprocessingDrawing" xmlns:w10="urn:schemas-microsoft-com:office:word" xmlns:w="http://purl.oclc.org/ooxml/wordprocessingml/main" xmlns:w14="http://schemas.microsoft.com/office/word/2010/wordml" xmlns:w15="http://schemas.microsoft.com/office/word/2012/wordml" xmlns:w16cex="http://schemas.microsoft.com/office/word/2018/wordml/cex" xmlns:w16cid="http://schemas.microsoft.com/office/word/2016/wordml/cid" xmlns:w16="http://schemas.microsoft.com/office/word/2018/wordml" xmlns:w16du="http://schemas.microsoft.com/office/word/2023/wordml/word16du" xmlns:w16sdtdh="http://schemas.microsoft.com/office/word/2020/wordml/sdtdatahash" xmlns:w16sdtfl="http://schemas.microsoft.com/office/word/2024/wordml/sdtformatlock" xmlns:w16se="http://schemas.microsoft.com/office/word/2015/wordml/symex" xmlns:wpi="http://schemas.microsoft.com/office/word/2010/wordprocessingInk" xmlns:wne="http://schemas.microsoft.com/office/word/2006/wordml" mc:Ignorable="w14 w15 w16se w16cid w16 w16cex w16sdtdh w16sdtfl w16du wne wp14" w:conformance="strict">
   <w:body>
     <w:p>
       <w:pPr>
@@ -45,34 +45,12 @@
     <w:p>
       <w:pPr>
         <w:pStyle w:val="Author"/>
-        <w:spacing w:before="5pt" w:beforeAutospacing="1" w:after="5pt" w:afterAutospacing="1"/>
+        <w:spacing w:before="5pt" w:beforeAutospacing="1" w:after="5pt" w:afterAutospacing="1" w:line="6pt" w:lineRule="auto"/>
+        <w:jc w:val="both"/>
         <w:rPr>
           <w:sz w:val="16"/>
           <w:szCs w:val="16"/>
-        </w:rPr>
-      </w:pPr>
-      <w:r>
-        <w:rPr>
-          <w:sz w:val="16"/>
-          <w:szCs w:val="16"/>
-        </w:rPr>
-        <w:t>*</w:t>
-      </w:r>
-      <w:r>
-        <w:rPr>
-          <w:sz w:val="16"/>
-          <w:szCs w:val="16"/>
-        </w:rPr>
-        <w:t>Note: Sub-titles are not captured in Xplore and should not be used</w:t>
-      </w:r>
-    </w:p>
-    <w:p>
-      <w:pPr>
-        <w:pStyle w:val="Author"/>
-        <w:spacing w:before="5pt" w:beforeAutospacing="1" w:after="5pt" w:afterAutospacing="1" w:line="6pt" w:lineRule="auto"/>
-        <w:rPr>
-          <w:sz w:val="16"/>
-          <w:szCs w:val="16"/>
+          <w:lang w:val="vi-VN"/>
         </w:rPr>
       </w:pPr>
     </w:p>
@@ -1539,10 +1517,7 @@
         <w:pStyle w:val="BodyText"/>
       </w:pPr>
       <w:r>
-        <w:t xml:space="preserve">The template is used to format your paper and style the text. All margins, column widths, line spaces, and text fonts are prescribed; please do not alter them. You may note peculiarities. For example, the head margin in this template measures proportionately more than is customary. This measurement and others are deliberate, using specifications that anticipate your paper as one part of the entire proceedings, </w:t>
-      </w:r>
-      <w:r>
-        <w:t>and not as an independent document. Please do not revise any of the current designations.</w:t>
+        <w:t>The template is used to format your paper and style the text. All margins, column widths, line spaces, and text fonts are prescribed; please do not alter them. You may note peculiarities. For example, the head margin in this template measures proportionately more than is customary. This measurement and others are deliberate, using specifications that anticipate your paper as one part of the entire proceedings, and not as an independent document. Please do not revise any of the current designations.</w:t>
       </w:r>
     </w:p>
     <w:p>
@@ -1603,15 +1578,7 @@
         <w:pStyle w:val="BodyText"/>
       </w:pPr>
       <w:r>
-        <w:t xml:space="preserve">Define abbreviations and acronyms the first time they are used in the text, even after they have been defined in the abstract. Abbreviations such as IEEE, SI, MKS, CGS, </w:t>
-      </w:r>
-      <w:proofErr w:type="spellStart"/>
-      <w:r>
-        <w:t>sc</w:t>
-      </w:r>
-      <w:proofErr w:type="spellEnd"/>
-      <w:r>
-        <w:t>, dc, and rms do not have to be defined. Do not use abbreviations in the title or heads unless they are unavoidable.</w:t>
+        <w:t>Define abbreviations and acronyms the first time they are used in the text, even after they have been defined in the abstract. Abbreviations such as IEEE, SI, MKS, CGS, sc, dc, and rms do not have to be defined. Do not use abbreviations in the title or heads unless they are unavoidable.</w:t>
       </w:r>
     </w:p>
     <w:p>
@@ -1641,15 +1608,7 @@
         <w:pStyle w:val="bulletlist"/>
       </w:pPr>
       <w:r>
-        <w:t xml:space="preserve">Avoid combining SI and CGS units, such as current in amperes and magnetic field in </w:t>
-      </w:r>
-      <w:proofErr w:type="spellStart"/>
-      <w:r>
-        <w:t>oersteds</w:t>
-      </w:r>
-      <w:proofErr w:type="spellEnd"/>
-      <w:r>
-        <w:t>. This often leads to confusion because equations do not balance dimensionally. If you must use mixed units, clearly state the units for each quantity that you use in an equation.</w:t>
+        <w:t>Avoid combining SI and CGS units, such as current in amperes and magnetic field in oersteds. This often leads to confusion because equations do not balance dimensionally. If you must use mixed units, clearly state the units for each quantity that you use in an equation.</w:t>
       </w:r>
     </w:p>
     <w:p>
@@ -1657,31 +1616,7 @@
         <w:pStyle w:val="bulletlist"/>
       </w:pPr>
       <w:r>
-        <w:t>Do not mix complete spellings and abbreviations of units: “Wb/m2” or “</w:t>
-      </w:r>
-      <w:proofErr w:type="spellStart"/>
-      <w:r>
-        <w:t>webers</w:t>
-      </w:r>
-      <w:proofErr w:type="spellEnd"/>
-      <w:r>
-        <w:t xml:space="preserve"> per square meter”, not “</w:t>
-      </w:r>
-      <w:proofErr w:type="spellStart"/>
-      <w:r>
-        <w:t>webers</w:t>
-      </w:r>
-      <w:proofErr w:type="spellEnd"/>
-      <w:r>
-        <w:t xml:space="preserve">/m2”.  Spell out units when they appear in text: “. . . a few </w:t>
-      </w:r>
-      <w:proofErr w:type="spellStart"/>
-      <w:r>
-        <w:t>henries</w:t>
-      </w:r>
-      <w:proofErr w:type="spellEnd"/>
-      <w:r>
-        <w:t>”, not “. . . a few H”.</w:t>
+        <w:t>Do not mix complete spellings and abbreviations of units: “Wb/m2” or “webers per square meter”, not “webers/m2”.  Spell out units when they appear in text: “. . . a few henries”, not “. . . a few H”.</w:t>
       </w:r>
     </w:p>
     <w:p>
@@ -1741,16 +1676,19 @@
         <w:pStyle w:val="Heading2"/>
       </w:pPr>
       <w:r>
+        <w:t>Equations</w:t>
+      </w:r>
+    </w:p>
+    <w:p>
+      <w:pPr>
+        <w:pStyle w:val="BodyText"/>
+      </w:pPr>
+      <w:r>
+        <w:t xml:space="preserve">The equations are an exception to the prescribed specifications of this template. You will need to determine whether or not your equation should be typed using either the Times New Roman or the Symbol font (please no other font). To create multileveled equations, it may be necessary to treat </w:t>
+      </w:r>
+      <w:r>
         <w:lastRenderedPageBreak/>
-        <w:t>Equations</w:t>
-      </w:r>
-    </w:p>
-    <w:p>
-      <w:pPr>
-        <w:pStyle w:val="BodyText"/>
-      </w:pPr>
-      <w:r>
-        <w:t>The equations are an exception to the prescribed specifications of this template. You will need to determine whether or not your equation should be typed using either the Times New Roman or the Symbol font (please no other font). To create multileveled equations, it may be necessary to treat the equation as a graphic and insert it into the text after your paper is styled.</w:t>
+        <w:t>the equation as a graphic and insert it into the text after your paper is styled.</w:t>
       </w:r>
     </w:p>
     <w:p>
@@ -2244,25 +2182,31 @@
         <w:pStyle w:val="Heading2"/>
       </w:pPr>
       <w:r>
+        <w:t>Figures and Tables</w:t>
+      </w:r>
+    </w:p>
+    <w:p>
+      <w:pPr>
+        <w:pStyle w:val="Heading4"/>
+      </w:pPr>
+      <w:r>
+        <w:t xml:space="preserve"> </w:t>
+      </w:r>
+      <w:r>
+        <w:t xml:space="preserve">Positioning Figures and Tables: </w:t>
+      </w:r>
+      <w:r>
+        <w:rPr>
+          <w:i w:val="0"/>
+        </w:rPr>
+        <w:t xml:space="preserve">Place figures and tables at the top and bottom of columns. Avoid placing them in the middle of columns. Large figures and tables may span across both columns. Figure captions should be below the figures; table heads should appear above the tables. Insert </w:t>
+      </w:r>
+      <w:r>
+        <w:rPr>
+          <w:i w:val="0"/>
+        </w:rPr>
         <w:lastRenderedPageBreak/>
-        <w:t>Figures and Tables</w:t>
-      </w:r>
-    </w:p>
-    <w:p>
-      <w:pPr>
-        <w:pStyle w:val="Heading4"/>
-      </w:pPr>
-      <w:r>
-        <w:t xml:space="preserve"> </w:t>
-      </w:r>
-      <w:r>
-        <w:t xml:space="preserve">Positioning Figures and Tables: </w:t>
-      </w:r>
-      <w:r>
-        <w:rPr>
-          <w:i w:val="0"/>
-        </w:rPr>
-        <w:t>Place figures and tables at the top and bottom of columns. Avoid placing them in the middle of columns. Large figures and tables may span across both columns. Figure captions should be below the figures; table heads should appear above the tables. Insert figures and tables after they are cited in the text. Use the abbreviation “Fig. 1”, even at the beginning of a sentence.</w:t>
+        <w:t>figures and tables after they are cited in the text. Use the abbreviation “Fig. 1”, even at the beginning of a sentence.</w:t>
       </w:r>
     </w:p>
     <w:p>
@@ -2597,7 +2541,6 @@
       <w:r>
         <w:t>”. Avoid the stilted expression “</w:t>
       </w:r>
-      <w:proofErr w:type="spellStart"/>
       <w:r>
         <w:rPr>
           <w:lang w:val="en-US"/>
@@ -2605,11 +2548,7 @@
         <w:t>o</w:t>
       </w:r>
       <w:r>
-        <w:t>ne</w:t>
-      </w:r>
-      <w:proofErr w:type="spellEnd"/>
-      <w:r>
-        <w:t xml:space="preserve"> of us (R. B. G.) thanks </w:t>
+        <w:t xml:space="preserve">ne of us (R. B. G.) thanks </w:t>
       </w:r>
       <w:r>
         <w:t>...</w:t>
@@ -2707,10 +2646,10 @@
         <w:t xml:space="preserve">’ </w:t>
       </w:r>
       <w:r>
-        <w:t xml:space="preserve">names; do not use “et al.”. Papers that have not been </w:t>
-      </w:r>
-      <w:r>
-        <w:t>published, even if they have been submitted for publication, should be cited as “unpublished” [4]. Papers that have been accepted for publication should be cited as “in press” [5]. Capitalize only the first word in a paper title, except for proper nouns and element symbols.</w:t>
+        <w:t xml:space="preserve">names; do not use “et al.”. Papers that have not been published, even if they have been submitted for publication, should be cited as “unpublished” [4]. Papers that have been accepted for publication should be cited as “in press” [5]. </w:t>
+      </w:r>
+      <w:r>
+        <w:t>Capitalize only the first word in a paper title, except for proper nouns and element symbols.</w:t>
       </w:r>
     </w:p>
     <w:p>
@@ -3140,7 +3079,7 @@
 </file>
 
 <file path=word/endnotes.xml><?xml version="1.0" encoding="utf-8"?>
-<w:endnotes xmlns:cx="http://schemas.microsoft.com/office/drawing/2014/chartex" xmlns:cx1="http://schemas.microsoft.com/office/drawing/2015/9/8/chartex" xmlns:cx2="http://schemas.microsoft.com/office/drawing/2015/10/21/chartex" xmlns:cx3="http://schemas.microsoft.com/office/drawing/2016/5/9/chartex" xmlns:cx4="http://schemas.microsoft.com/office/drawing/2016/5/10/chartex" xmlns:cx5="http://schemas.microsoft.com/office/drawing/2016/5/11/chartex" xmlns:cx6="http://schemas.microsoft.com/office/drawing/2016/5/12/chartex" xmlns:cx7="http://schemas.microsoft.com/office/drawing/2016/5/13/chartex" xmlns:cx8="http://schemas.microsoft.com/office/drawing/2016/5/14/chartex" xmlns:mc="http://schemas.openxmlformats.org/markup-compatibility/2006" xmlns:aink="http://schemas.microsoft.com/office/drawing/2016/ink" xmlns:am3d="http://schemas.microsoft.com/office/drawing/2017/model3d" xmlns:o="urn:schemas-microsoft-com:office:office" xmlns:oel="http://schemas.microsoft.com/office/2019/extlst" xmlns:r="http://purl.oclc.org/ooxml/officeDocument/relationships" xmlns:m="http://purl.oclc.org/ooxml/officeDocument/math" xmlns:v="urn:schemas-microsoft-com:vml" xmlns:wp14="http://schemas.microsoft.com/office/word/2010/wordprocessingDrawing" xmlns:wp="http://purl.oclc.org/ooxml/drawingml/wordprocessingDrawing" xmlns:w10="urn:schemas-microsoft-com:office:word" xmlns:w="http://purl.oclc.org/ooxml/wordprocessingml/main" xmlns:w14="http://schemas.microsoft.com/office/word/2010/wordml" xmlns:w15="http://schemas.microsoft.com/office/word/2012/wordml" xmlns:w16cex="http://schemas.microsoft.com/office/word/2018/wordml/cex" xmlns:w16cid="http://schemas.microsoft.com/office/word/2016/wordml/cid" xmlns:w16="http://schemas.microsoft.com/office/word/2018/wordml" xmlns:w16sdtdh="http://schemas.microsoft.com/office/word/2020/wordml/sdtdatahash" xmlns:w16se="http://schemas.microsoft.com/office/word/2015/wordml/symex" xmlns:wpi="http://schemas.microsoft.com/office/word/2010/wordprocessingInk" xmlns:wne="http://schemas.microsoft.com/office/word/2006/wordml" mc:Ignorable="w14 w15 w16se w16cid w16 w16cex w16sdtdh wne wp14">
+<w:endnotes xmlns:cx="http://schemas.microsoft.com/office/drawing/2014/chartex" xmlns:cx1="http://schemas.microsoft.com/office/drawing/2015/9/8/chartex" xmlns:cx2="http://schemas.microsoft.com/office/drawing/2015/10/21/chartex" xmlns:cx3="http://schemas.microsoft.com/office/drawing/2016/5/9/chartex" xmlns:cx4="http://schemas.microsoft.com/office/drawing/2016/5/10/chartex" xmlns:cx5="http://schemas.microsoft.com/office/drawing/2016/5/11/chartex" xmlns:cx6="http://schemas.microsoft.com/office/drawing/2016/5/12/chartex" xmlns:cx7="http://schemas.microsoft.com/office/drawing/2016/5/13/chartex" xmlns:cx8="http://schemas.microsoft.com/office/drawing/2016/5/14/chartex" xmlns:mc="http://schemas.openxmlformats.org/markup-compatibility/2006" xmlns:aink="http://schemas.microsoft.com/office/drawing/2016/ink" xmlns:am3d="http://schemas.microsoft.com/office/drawing/2017/model3d" xmlns:o="urn:schemas-microsoft-com:office:office" xmlns:oel="http://schemas.microsoft.com/office/2019/extlst" xmlns:r="http://purl.oclc.org/ooxml/officeDocument/relationships" xmlns:m="http://purl.oclc.org/ooxml/officeDocument/math" xmlns:v="urn:schemas-microsoft-com:vml" xmlns:wp14="http://schemas.microsoft.com/office/word/2010/wordprocessingDrawing" xmlns:wp="http://purl.oclc.org/ooxml/drawingml/wordprocessingDrawing" xmlns:w10="urn:schemas-microsoft-com:office:word" xmlns:w="http://purl.oclc.org/ooxml/wordprocessingml/main" xmlns:w14="http://schemas.microsoft.com/office/word/2010/wordml" xmlns:w15="http://schemas.microsoft.com/office/word/2012/wordml" xmlns:w16cex="http://schemas.microsoft.com/office/word/2018/wordml/cex" xmlns:w16cid="http://schemas.microsoft.com/office/word/2016/wordml/cid" xmlns:w16="http://schemas.microsoft.com/office/word/2018/wordml" xmlns:w16du="http://schemas.microsoft.com/office/word/2023/wordml/word16du" xmlns:w16sdtdh="http://schemas.microsoft.com/office/word/2020/wordml/sdtdatahash" xmlns:w16sdtfl="http://schemas.microsoft.com/office/word/2024/wordml/sdtformatlock" xmlns:w16se="http://schemas.microsoft.com/office/word/2015/wordml/symex" xmlns:wpi="http://schemas.microsoft.com/office/word/2010/wordprocessingInk" xmlns:wne="http://schemas.microsoft.com/office/word/2006/wordml" mc:Ignorable="w14 w15 w16se w16cid w16 w16cex w16sdtdh w16sdtfl w16du wne wp14">
   <w:endnote w:type="separator" w:id="-1">
     <w:p>
       <w:r>
@@ -3159,7 +3098,7 @@
 </file>
 
 <file path=word/footer1.xml><?xml version="1.0" encoding="utf-8"?>
-<w:ftr xmlns:cx="http://schemas.microsoft.com/office/drawing/2014/chartex" xmlns:cx1="http://schemas.microsoft.com/office/drawing/2015/9/8/chartex" xmlns:cx2="http://schemas.microsoft.com/office/drawing/2015/10/21/chartex" xmlns:cx3="http://schemas.microsoft.com/office/drawing/2016/5/9/chartex" xmlns:cx4="http://schemas.microsoft.com/office/drawing/2016/5/10/chartex" xmlns:cx5="http://schemas.microsoft.com/office/drawing/2016/5/11/chartex" xmlns:cx6="http://schemas.microsoft.com/office/drawing/2016/5/12/chartex" xmlns:cx7="http://schemas.microsoft.com/office/drawing/2016/5/13/chartex" xmlns:cx8="http://schemas.microsoft.com/office/drawing/2016/5/14/chartex" xmlns:mc="http://schemas.openxmlformats.org/markup-compatibility/2006" xmlns:aink="http://schemas.microsoft.com/office/drawing/2016/ink" xmlns:am3d="http://schemas.microsoft.com/office/drawing/2017/model3d" xmlns:o="urn:schemas-microsoft-com:office:office" xmlns:oel="http://schemas.microsoft.com/office/2019/extlst" xmlns:r="http://purl.oclc.org/ooxml/officeDocument/relationships" xmlns:m="http://purl.oclc.org/ooxml/officeDocument/math" xmlns:v="urn:schemas-microsoft-com:vml" xmlns:wp14="http://schemas.microsoft.com/office/word/2010/wordprocessingDrawing" xmlns:wp="http://purl.oclc.org/ooxml/drawingml/wordprocessingDrawing" xmlns:w10="urn:schemas-microsoft-com:office:word" xmlns:w="http://purl.oclc.org/ooxml/wordprocessingml/main" xmlns:w14="http://schemas.microsoft.com/office/word/2010/wordml" xmlns:w15="http://schemas.microsoft.com/office/word/2012/wordml" xmlns:w16cex="http://schemas.microsoft.com/office/word/2018/wordml/cex" xmlns:w16cid="http://schemas.microsoft.com/office/word/2016/wordml/cid" xmlns:w16="http://schemas.microsoft.com/office/word/2018/wordml" xmlns:w16sdtdh="http://schemas.microsoft.com/office/word/2020/wordml/sdtdatahash" xmlns:w16se="http://schemas.microsoft.com/office/word/2015/wordml/symex" xmlns:wpi="http://schemas.microsoft.com/office/word/2010/wordprocessingInk" xmlns:wne="http://schemas.microsoft.com/office/word/2006/wordml" mc:Ignorable="w14 w15 w16se w16cid w16 w16cex w16sdtdh wne wp14">
+<w:ftr xmlns:cx="http://schemas.microsoft.com/office/drawing/2014/chartex" xmlns:cx1="http://schemas.microsoft.com/office/drawing/2015/9/8/chartex" xmlns:cx2="http://schemas.microsoft.com/office/drawing/2015/10/21/chartex" xmlns:cx3="http://schemas.microsoft.com/office/drawing/2016/5/9/chartex" xmlns:cx4="http://schemas.microsoft.com/office/drawing/2016/5/10/chartex" xmlns:cx5="http://schemas.microsoft.com/office/drawing/2016/5/11/chartex" xmlns:cx6="http://schemas.microsoft.com/office/drawing/2016/5/12/chartex" xmlns:cx7="http://schemas.microsoft.com/office/drawing/2016/5/13/chartex" xmlns:cx8="http://schemas.microsoft.com/office/drawing/2016/5/14/chartex" xmlns:mc="http://schemas.openxmlformats.org/markup-compatibility/2006" xmlns:aink="http://schemas.microsoft.com/office/drawing/2016/ink" xmlns:am3d="http://schemas.microsoft.com/office/drawing/2017/model3d" xmlns:o="urn:schemas-microsoft-com:office:office" xmlns:oel="http://schemas.microsoft.com/office/2019/extlst" xmlns:r="http://purl.oclc.org/ooxml/officeDocument/relationships" xmlns:m="http://purl.oclc.org/ooxml/officeDocument/math" xmlns:v="urn:schemas-microsoft-com:vml" xmlns:wp14="http://schemas.microsoft.com/office/word/2010/wordprocessingDrawing" xmlns:wp="http://purl.oclc.org/ooxml/drawingml/wordprocessingDrawing" xmlns:w10="urn:schemas-microsoft-com:office:word" xmlns:w="http://purl.oclc.org/ooxml/wordprocessingml/main" xmlns:w14="http://schemas.microsoft.com/office/word/2010/wordml" xmlns:w15="http://schemas.microsoft.com/office/word/2012/wordml" xmlns:w16cex="http://schemas.microsoft.com/office/word/2018/wordml/cex" xmlns:w16cid="http://schemas.microsoft.com/office/word/2016/wordml/cid" xmlns:w16="http://schemas.microsoft.com/office/word/2018/wordml" xmlns:w16du="http://schemas.microsoft.com/office/word/2023/wordml/word16du" xmlns:w16sdtdh="http://schemas.microsoft.com/office/word/2020/wordml/sdtdatahash" xmlns:w16sdtfl="http://schemas.microsoft.com/office/word/2024/wordml/sdtformatlock" xmlns:w16se="http://schemas.microsoft.com/office/word/2015/wordml/symex" xmlns:wpi="http://schemas.microsoft.com/office/word/2010/wordprocessingInk" xmlns:wne="http://schemas.microsoft.com/office/word/2006/wordml" mc:Ignorable="w14 w15 w16se w16cid w16 w16cex w16sdtdh w16sdtfl w16du wne wp14">
   <w:p>
     <w:pPr>
       <w:pStyle w:val="Footer"/>
@@ -3181,7 +3120,7 @@
 </file>
 
 <file path=word/footnotes.xml><?xml version="1.0" encoding="utf-8"?>
-<w:footnotes xmlns:cx="http://schemas.microsoft.com/office/drawing/2014/chartex" xmlns:cx1="http://schemas.microsoft.com/office/drawing/2015/9/8/chartex" xmlns:cx2="http://schemas.microsoft.com/office/drawing/2015/10/21/chartex" xmlns:cx3="http://schemas.microsoft.com/office/drawing/2016/5/9/chartex" xmlns:cx4="http://schemas.microsoft.com/office/drawing/2016/5/10/chartex" xmlns:cx5="http://schemas.microsoft.com/office/drawing/2016/5/11/chartex" xmlns:cx6="http://schemas.microsoft.com/office/drawing/2016/5/12/chartex" xmlns:cx7="http://schemas.microsoft.com/office/drawing/2016/5/13/chartex" xmlns:cx8="http://schemas.microsoft.com/office/drawing/2016/5/14/chartex" xmlns:mc="http://schemas.openxmlformats.org/markup-compatibility/2006" xmlns:aink="http://schemas.microsoft.com/office/drawing/2016/ink" xmlns:am3d="http://schemas.microsoft.com/office/drawing/2017/model3d" xmlns:o="urn:schemas-microsoft-com:office:office" xmlns:oel="http://schemas.microsoft.com/office/2019/extlst" xmlns:r="http://purl.oclc.org/ooxml/officeDocument/relationships" xmlns:m="http://purl.oclc.org/ooxml/officeDocument/math" xmlns:v="urn:schemas-microsoft-com:vml" xmlns:wp14="http://schemas.microsoft.com/office/word/2010/wordprocessingDrawing" xmlns:wp="http://purl.oclc.org/ooxml/drawingml/wordprocessingDrawing" xmlns:w10="urn:schemas-microsoft-com:office:word" xmlns:w="http://purl.oclc.org/ooxml/wordprocessingml/main" xmlns:w14="http://schemas.microsoft.com/office/word/2010/wordml" xmlns:w15="http://schemas.microsoft.com/office/word/2012/wordml" xmlns:w16cex="http://schemas.microsoft.com/office/word/2018/wordml/cex" xmlns:w16cid="http://schemas.microsoft.com/office/word/2016/wordml/cid" xmlns:w16="http://schemas.microsoft.com/office/word/2018/wordml" xmlns:w16sdtdh="http://schemas.microsoft.com/office/word/2020/wordml/sdtdatahash" xmlns:w16se="http://schemas.microsoft.com/office/word/2015/wordml/symex" xmlns:wpi="http://schemas.microsoft.com/office/word/2010/wordprocessingInk" xmlns:wne="http://schemas.microsoft.com/office/word/2006/wordml" mc:Ignorable="w14 w15 w16se w16cid w16 w16cex w16sdtdh wne wp14">
+<w:footnotes xmlns:cx="http://schemas.microsoft.com/office/drawing/2014/chartex" xmlns:cx1="http://schemas.microsoft.com/office/drawing/2015/9/8/chartex" xmlns:cx2="http://schemas.microsoft.com/office/drawing/2015/10/21/chartex" xmlns:cx3="http://schemas.microsoft.com/office/drawing/2016/5/9/chartex" xmlns:cx4="http://schemas.microsoft.com/office/drawing/2016/5/10/chartex" xmlns:cx5="http://schemas.microsoft.com/office/drawing/2016/5/11/chartex" xmlns:cx6="http://schemas.microsoft.com/office/drawing/2016/5/12/chartex" xmlns:cx7="http://schemas.microsoft.com/office/drawing/2016/5/13/chartex" xmlns:cx8="http://schemas.microsoft.com/office/drawing/2016/5/14/chartex" xmlns:mc="http://schemas.openxmlformats.org/markup-compatibility/2006" xmlns:aink="http://schemas.microsoft.com/office/drawing/2016/ink" xmlns:am3d="http://schemas.microsoft.com/office/drawing/2017/model3d" xmlns:o="urn:schemas-microsoft-com:office:office" xmlns:oel="http://schemas.microsoft.com/office/2019/extlst" xmlns:r="http://purl.oclc.org/ooxml/officeDocument/relationships" xmlns:m="http://purl.oclc.org/ooxml/officeDocument/math" xmlns:v="urn:schemas-microsoft-com:vml" xmlns:wp14="http://schemas.microsoft.com/office/word/2010/wordprocessingDrawing" xmlns:wp="http://purl.oclc.org/ooxml/drawingml/wordprocessingDrawing" xmlns:w10="urn:schemas-microsoft-com:office:word" xmlns:w="http://purl.oclc.org/ooxml/wordprocessingml/main" xmlns:w14="http://schemas.microsoft.com/office/word/2010/wordml" xmlns:w15="http://schemas.microsoft.com/office/word/2012/wordml" xmlns:w16cex="http://schemas.microsoft.com/office/word/2018/wordml/cex" xmlns:w16cid="http://schemas.microsoft.com/office/word/2016/wordml/cid" xmlns:w16="http://schemas.microsoft.com/office/word/2018/wordml" xmlns:w16du="http://schemas.microsoft.com/office/word/2023/wordml/word16du" xmlns:w16sdtdh="http://schemas.microsoft.com/office/word/2020/wordml/sdtdatahash" xmlns:w16sdtfl="http://schemas.microsoft.com/office/word/2024/wordml/sdtformatlock" xmlns:w16se="http://schemas.microsoft.com/office/word/2015/wordml/symex" xmlns:wpi="http://schemas.microsoft.com/office/word/2010/wordprocessingInk" xmlns:wne="http://schemas.microsoft.com/office/word/2006/wordml" mc:Ignorable="w14 w15 w16se w16cid w16 w16cex w16sdtdh w16sdtfl w16du wne wp14">
   <w:footnote w:type="separator" w:id="-1">
     <w:p>
       <w:r>
@@ -3200,7 +3139,7 @@
 </file>
 
 <file path=word/numbering.xml><?xml version="1.0" encoding="utf-8"?>
-<w:numbering xmlns:cx="http://schemas.microsoft.com/office/drawing/2014/chartex" xmlns:cx1="http://schemas.microsoft.com/office/drawing/2015/9/8/chartex" xmlns:cx2="http://schemas.microsoft.com/office/drawing/2015/10/21/chartex" xmlns:cx3="http://schemas.microsoft.com/office/drawing/2016/5/9/chartex" xmlns:cx4="http://schemas.microsoft.com/office/drawing/2016/5/10/chartex" xmlns:cx5="http://schemas.microsoft.com/office/drawing/2016/5/11/chartex" xmlns:cx6="http://schemas.microsoft.com/office/drawing/2016/5/12/chartex" xmlns:cx7="http://schemas.microsoft.com/office/drawing/2016/5/13/chartex" xmlns:cx8="http://schemas.microsoft.com/office/drawing/2016/5/14/chartex" xmlns:mc="http://schemas.openxmlformats.org/markup-compatibility/2006" xmlns:aink="http://schemas.microsoft.com/office/drawing/2016/ink" xmlns:am3d="http://schemas.microsoft.com/office/drawing/2017/model3d" xmlns:o="urn:schemas-microsoft-com:office:office" xmlns:oel="http://schemas.microsoft.com/office/2019/extlst" xmlns:r="http://purl.oclc.org/ooxml/officeDocument/relationships" xmlns:m="http://purl.oclc.org/ooxml/officeDocument/math" xmlns:v="urn:schemas-microsoft-com:vml" xmlns:wp14="http://schemas.microsoft.com/office/word/2010/wordprocessingDrawing" xmlns:wp="http://purl.oclc.org/ooxml/drawingml/wordprocessingDrawing" xmlns:w10="urn:schemas-microsoft-com:office:word" xmlns:w="http://purl.oclc.org/ooxml/wordprocessingml/main" xmlns:w14="http://schemas.microsoft.com/office/word/2010/wordml" xmlns:w15="http://schemas.microsoft.com/office/word/2012/wordml" xmlns:w16cex="http://schemas.microsoft.com/office/word/2018/wordml/cex" xmlns:w16cid="http://schemas.microsoft.com/office/word/2016/wordml/cid" xmlns:w16="http://schemas.microsoft.com/office/word/2018/wordml" xmlns:w16sdtdh="http://schemas.microsoft.com/office/word/2020/wordml/sdtdatahash" xmlns:w16se="http://schemas.microsoft.com/office/word/2015/wordml/symex" xmlns:wpi="http://schemas.microsoft.com/office/word/2010/wordprocessingInk" xmlns:wne="http://schemas.microsoft.com/office/word/2006/wordml" mc:Ignorable="w14 w15 w16se w16cid w16 w16cex w16sdtdh wne wp14">
+<w:numbering xmlns:cx="http://schemas.microsoft.com/office/drawing/2014/chartex" xmlns:cx1="http://schemas.microsoft.com/office/drawing/2015/9/8/chartex" xmlns:cx2="http://schemas.microsoft.com/office/drawing/2015/10/21/chartex" xmlns:cx3="http://schemas.microsoft.com/office/drawing/2016/5/9/chartex" xmlns:cx4="http://schemas.microsoft.com/office/drawing/2016/5/10/chartex" xmlns:cx5="http://schemas.microsoft.com/office/drawing/2016/5/11/chartex" xmlns:cx6="http://schemas.microsoft.com/office/drawing/2016/5/12/chartex" xmlns:cx7="http://schemas.microsoft.com/office/drawing/2016/5/13/chartex" xmlns:cx8="http://schemas.microsoft.com/office/drawing/2016/5/14/chartex" xmlns:mc="http://schemas.openxmlformats.org/markup-compatibility/2006" xmlns:aink="http://schemas.microsoft.com/office/drawing/2016/ink" xmlns:am3d="http://schemas.microsoft.com/office/drawing/2017/model3d" xmlns:o="urn:schemas-microsoft-com:office:office" xmlns:oel="http://schemas.microsoft.com/office/2019/extlst" xmlns:r="http://purl.oclc.org/ooxml/officeDocument/relationships" xmlns:m="http://purl.oclc.org/ooxml/officeDocument/math" xmlns:v="urn:schemas-microsoft-com:vml" xmlns:wp14="http://schemas.microsoft.com/office/word/2010/wordprocessingDrawing" xmlns:wp="http://purl.oclc.org/ooxml/drawingml/wordprocessingDrawing" xmlns:w10="urn:schemas-microsoft-com:office:word" xmlns:w="http://purl.oclc.org/ooxml/wordprocessingml/main" xmlns:w14="http://schemas.microsoft.com/office/word/2010/wordml" xmlns:w15="http://schemas.microsoft.com/office/word/2012/wordml" xmlns:w16cex="http://schemas.microsoft.com/office/word/2018/wordml/cex" xmlns:w16cid="http://schemas.microsoft.com/office/word/2016/wordml/cid" xmlns:w16="http://schemas.microsoft.com/office/word/2018/wordml" xmlns:w16du="http://schemas.microsoft.com/office/word/2023/wordml/word16du" xmlns:w16sdtdh="http://schemas.microsoft.com/office/word/2020/wordml/sdtdatahash" xmlns:w16sdtfl="http://schemas.microsoft.com/office/word/2024/wordml/sdtformatlock" xmlns:w16se="http://schemas.microsoft.com/office/word/2015/wordml/symex" xmlns:wpi="http://schemas.microsoft.com/office/word/2010/wordprocessingInk" xmlns:wne="http://schemas.microsoft.com/office/word/2006/wordml" mc:Ignorable="w14 w15 w16se w16cid w16 w16cex w16sdtdh w16sdtfl w16du wne wp14">
   <w:abstractNum w:abstractNumId="0" w15:restartNumberingAfterBreak="0">
     <w:nsid w:val="FFFFFF1D"/>
     <w:multiLevelType w:val="multilevel"/>
@@ -4668,7 +4607,7 @@
 </file>
 
 <file path=word/styles.xml><?xml version="1.0" encoding="utf-8"?>
-<w:styles xmlns:mc="http://schemas.openxmlformats.org/markup-compatibility/2006" xmlns:r="http://purl.oclc.org/ooxml/officeDocument/relationships" xmlns:w="http://purl.oclc.org/ooxml/wordprocessingml/main" xmlns:w14="http://schemas.microsoft.com/office/word/2010/wordml" xmlns:w15="http://schemas.microsoft.com/office/word/2012/wordml" xmlns:w16cex="http://schemas.microsoft.com/office/word/2018/wordml/cex" xmlns:w16cid="http://schemas.microsoft.com/office/word/2016/wordml/cid" xmlns:w16="http://schemas.microsoft.com/office/word/2018/wordml" xmlns:w16sdtdh="http://schemas.microsoft.com/office/word/2020/wordml/sdtdatahash" xmlns:w16se="http://schemas.microsoft.com/office/word/2015/wordml/symex" mc:Ignorable="w14 w15 w16se w16cid w16 w16cex w16sdtdh">
+<w:styles xmlns:mc="http://schemas.openxmlformats.org/markup-compatibility/2006" xmlns:r="http://purl.oclc.org/ooxml/officeDocument/relationships" xmlns:w="http://purl.oclc.org/ooxml/wordprocessingml/main" xmlns:w14="http://schemas.microsoft.com/office/word/2010/wordml" xmlns:w15="http://schemas.microsoft.com/office/word/2012/wordml" xmlns:w16cex="http://schemas.microsoft.com/office/word/2018/wordml/cex" xmlns:w16cid="http://schemas.microsoft.com/office/word/2016/wordml/cid" xmlns:w16="http://schemas.microsoft.com/office/word/2018/wordml" xmlns:w16du="http://schemas.microsoft.com/office/word/2023/wordml/word16du" xmlns:w16sdtdh="http://schemas.microsoft.com/office/word/2020/wordml/sdtdatahash" xmlns:w16sdtfl="http://schemas.microsoft.com/office/word/2024/wordml/sdtformatlock" xmlns:w16se="http://schemas.microsoft.com/office/word/2015/wordml/symex" mc:Ignorable="w14 w15 w16se w16cid w16 w16cex w16sdtdh w16sdtfl w16du">
   <w:docDefaults>
     <w:rPrDefault>
       <w:rPr>

</xml_diff>